<commit_message>
Add Part IX (Prophecy, Miracle & Origins) and darken dark theme
New part with 6 issues: failed prophecies, the i'jaz literary challenge,
borrowed apocryphal sources, the inheritance 'awl arithmetic, pagan ritual
continuity, and the night-journey prayer negotiation. Site now 9 parts / 55
issues; conclusion and bibliography updated; Word document regenerated.
Dark theme shifted from blue-charcoal to near-black neutral.

Co-Authored-By: Claude Fable 5 <noreply@anthropic.com>
</commit_message>
<xml_diff>
--- a/Examining-Islam-from-Within.docx
+++ b/Examining-Islam-from-Within.docx
@@ -3162,6 +3162,360 @@
         <w:pageBreakBefore/>
       </w:pPr>
       <w:r>
+        <w:t xml:space="preserve">Part IX — Prophecy, Miracle, and Origins: The Affirmative Case</w:t>
+      </w:r>
+    </w:p>
+    <w:p>
+      <w:pPr>
+        <w:spacing w:after="160"/>
+        <w:jc w:val="both"/>
+      </w:pPr>
+      <w:r>
+        <w:t xml:space="preserve">The preceding parts test Islam’s claims against its own sources from the inside. This closing part turns to the affirmative evidences Islam offers for its own truth — fulfilled prophecy, an inimitable book, divinely original revelation, mathematically perfect law, and rites of pure monotheism — and asks whether they survive examination. The critic’s contention is that each advertised proof, scrutinized on Islam’s own terms, fails or reverses: the prophecies miscarry, the literary miracle is unfalsifiable, the contents are demonstrably borrowed, the law’s arithmetic does not balance, the rituals are pre-Islamic, and the very ascent narrative shows God revising His decree. As before, the strongest Muslim responses precede each counter-rebuttal.</w:t>
+      </w:r>
+    </w:p>
+    <w:p>
+      <w:pPr>
+        <w:pStyle w:val="Heading2"/>
+      </w:pPr>
+      <w:r>
+        <w:t xml:space="preserve">1. Failed and Unfulfilled Prophecies</w:t>
+      </w:r>
+    </w:p>
+    <w:p>
+      <w:pPr>
+        <w:spacing w:after="160" w:before="120"/>
+        <w:jc w:val="both"/>
+      </w:pPr>
+      <w:r>
+        <w:rPr>
+          <w:b/>
+          <w:bCs/>
+        </w:rPr>
+        <w:t xml:space="preserve">The Critique. </w:t>
+      </w:r>
+      <w:r>
+        <w:t xml:space="preserve">The Quran and the sahih hadith repeatedly present the Hour as imminent for the seventh-century audience. “The Hour has drawn near, and the moon has split” (Quran 54:1); “The matter of the Hour is but as a twinkling of the eye, or even nearer” (16:77); “Perhaps the Hour is near” (33:63; 42:17). The hadith are sharper. Muhammad held up two fingers: “I have been sent and the Hour like these two” (Sahih al-Bukhari 6504; Muslim 2950). Looking at a boy, he said: “If this boy lives, he will not grow old before the Hour comes upon you” (Bukhari 6511; Muslim 2953). And the most concrete: late in life, “There is no soul alive today upon whom a hundred years will pass” and still be living — Muslim 2538, which the audience took as a horizon on the world itself. Fourteen centuries later the Hour has not come. By the test of Deuteronomy 18:22 — the prophecy that does not come to pass was not spoken by God — and by ordinary standards of prediction, the imminence sayings failed. Critics add the contested “Romans” prophecy (30:2–4): its very vowelling (sayaghlibun, “will conquer,” vs. sayughlabun, “will be conquered”) was disputed by early reciters, so the text’s predictive content depends on which reading one adopts after the events.</w:t>
+      </w:r>
+    </w:p>
+    <w:p>
+      <w:pPr>
+        <w:spacing w:after="160" w:before="120"/>
+        <w:jc w:val="both"/>
+      </w:pPr>
+      <w:r>
+        <w:rPr>
+          <w:b/>
+          <w:bCs/>
+        </w:rPr>
+        <w:t xml:space="preserve">Common Muslim Responses. </w:t>
+      </w:r>
+      <w:r>
+        <w:t xml:space="preserve">Muslim scholars answer that “near” is relative to God’s timescale — “a day with your Lord is as a thousand years” (22:47) — and to the totality of cosmic history, of which the prophetic era is the final age; nearness signals certainty and the last dispensation, not a calendar date. The hundred-years hadith (Muslim 2538) is widely read as meaning that none of that specific generation would remain alive, i.e., the passing of the Companions’ cohort, which came true, not a prediction of the world’s end. The two-fingers saying conveys that no prophet comes between Muhammad and the Hour. The Byzantine prophecy (30:2–4) is presented as a striking fulfilled prediction — Rome’s defeat by Persia reversed at Nineveh (627) — with the canonical reading sayaghlibun.</w:t>
+      </w:r>
+    </w:p>
+    <w:p>
+      <w:pPr>
+        <w:spacing w:after="160" w:before="120"/>
+        <w:jc w:val="both"/>
+      </w:pPr>
+      <w:r>
+        <w:rPr>
+          <w:b/>
+          <w:bCs/>
+        </w:rPr>
+        <w:t xml:space="preserve">Counter-Rebuttal. </w:t>
+      </w:r>
+      <w:r>
+        <w:t xml:space="preserve">Critics reply that the relativizing move empties the words of the meaning their first hearers necessarily took: a warner who tells his community the Hour is “nearer than a blink” and that a living boy may see it is communicating urgency to them, and if “near” can mean “within millennia,” the warning was not truthful communication. The generation-reading of the hundred-years hadith is the charitable gloss, but the surrounding eschatological sayings show a community braced for the end, and early scholars (al-Tabari among them) had to convert imminent-doom expectation into orderly historical periodization precisely because the deadline lapsed. On the Romans prophecy, the unpointed early script made sayaghlibun and sayughlabun visually identical, the reading is reported as contested among the Companions, and a prediction whose direction is fixed only after the outcome — and whose “within a few years” (bidʿ sinin) had to be stretched to nine — is weak evidence for the divine authorship it is marshaled to prove.</w:t>
+      </w:r>
+    </w:p>
+    <w:p>
+      <w:pPr>
+        <w:pStyle w:val="Heading2"/>
+      </w:pPr>
+      <w:r>
+        <w:t xml:space="preserve">2. The Literary Challenge (I‘jaz) and Its Unfalsifiability</w:t>
+      </w:r>
+    </w:p>
+    <w:p>
+      <w:pPr>
+        <w:spacing w:after="160" w:before="120"/>
+        <w:jc w:val="both"/>
+      </w:pPr>
+      <w:r>
+        <w:rPr>
+          <w:b/>
+          <w:bCs/>
+        </w:rPr>
+        <w:t xml:space="preserve">The Critique. </w:t>
+      </w:r>
+      <w:r>
+        <w:t xml:space="preserve">Islam’s premier evidential miracle is the Quran itself: the doctrine of i‘jaz holds the book to be literarily inimitable, and the Quran stakes its origin on a challenge (tahaddi) — produce ten surahs like it (11:13), or a single surah (2:23; 10:38), “and you will not” (2:24). The critique is fourfold. First, the challenge is unfalsifiable in practice: the criterion of “likeness” is undefined and adjudicated by Muslim scholars who begin from the premise that no rival can succeed, so every attempt is declared a failure by definition. Second, the standard is subjective: literary excellence is not a measurable property, and aesthetic judgments vary by language, era, and taste — billions who do not read classical Arabic cannot assess it at all, which is a strange feature for a universal proof. Third, rivals were in fact composed (the verses attributed to Musaylima; later pastiches) and simply ruled inadmissible. Fourth, the doctrine is historically late: i‘jaz became a developed science only in the ninth–eleventh centuries (al-Jurjani’s Dala’il al-I‘jaz, d. 1078), two to four centuries after the Quran, which is when the apologetic need arose — not a sign of an evidence self-evident from the start.</w:t>
+      </w:r>
+    </w:p>
+    <w:p>
+      <w:pPr>
+        <w:spacing w:after="160" w:before="120"/>
+        <w:jc w:val="both"/>
+      </w:pPr>
+      <w:r>
+        <w:rPr>
+          <w:b/>
+          <w:bCs/>
+        </w:rPr>
+        <w:t xml:space="preserve">Common Muslim Responses. </w:t>
+      </w:r>
+      <w:r>
+        <w:t xml:space="preserve">Muslim scholars respond that the Arabs of Muhammad’s day were the supreme masters of their language, motivated by every incentive to refute him cheaply by meeting the challenge, and they could not — choosing war over the easier path of composition, which is powerful circumstantial evidence. The inimitability lies in a unique fusion of linguistic form, rhetorical structure (nazm), and meaning that connoisseurs of Arabic recognize; the lateness of the formal science reflects the maturation of Arabic literary theory, not the absence of the experience, which the earliest Muslims attest. Musaylima’s reported verses are, by consensus of the sources, transparently inferior.</w:t>
+      </w:r>
+    </w:p>
+    <w:p>
+      <w:pPr>
+        <w:spacing w:after="160" w:before="120"/>
+        <w:jc w:val="both"/>
+      </w:pPr>
+      <w:r>
+        <w:rPr>
+          <w:b/>
+          <w:bCs/>
+        </w:rPr>
+        <w:t xml:space="preserve">Counter-Rebuttal. </w:t>
+      </w:r>
+      <w:r>
+        <w:t xml:space="preserve">Critics answer that “the experts judged no one matched it, and the experts are the believers” is circular, and that the silence of seventh-century Arabia is not documented neutrally — our reports of who tried and failed come from the tradition that needed them to fail, while a state that suppressed rival recitations (Part III) and killed satirical poets (Part VII) did not offer a level field for competitors. The deeper problem is in principle: an evidential miracle should be checkable by its intended audience, yet this one is inaccessible to non-Arabophones and irreducibly a matter of taste even among Arabophones — Muslim and non-Muslim native speakers reach opposite verdicts. A proof that only persuades those already persuaded, formalized centuries after the fact, is apologetics, not demonstration.</w:t>
+      </w:r>
+    </w:p>
+    <w:p>
+      <w:pPr>
+        <w:pStyle w:val="Heading2"/>
+      </w:pPr>
+      <w:r>
+        <w:t xml:space="preserve">3. Borrowed Apocryphal and Legendary Sources</w:t>
+      </w:r>
+    </w:p>
+    <w:p>
+      <w:pPr>
+        <w:spacing w:after="160" w:before="120"/>
+        <w:jc w:val="both"/>
+      </w:pPr>
+      <w:r>
+        <w:rPr>
+          <w:b/>
+          <w:bCs/>
+        </w:rPr>
+        <w:t xml:space="preserve">The Critique. </w:t>
+      </w:r>
+      <w:r>
+        <w:t xml:space="preserve">The Quran claims to relay revealed history unknown to Muhammad — “That is from the news of the unseen which We reveal to you; you knew it not, neither you nor your people, before this” (11:49). Yet several of its distinctive narratives track demonstrably earlier, non-canonical legends circulating in late antiquity. The infant Jesus speaks from the cradle (Quran 19:29–30) — paralleled in the Arabic Infancy Gospel. Jesus fashions birds from clay and breathes life into them (3:49; 5:110) — a scene from the second-century Infancy Gospel of Thomas, an apocryphal text no church canonized. The Seven Sleepers of the cave (Surah 18:9–26) retells a Christian legend of the Sleepers of Ephesus. The story of Dhul-Qarnayn building a barrier against Gog and Magog (18:83–98) closely follows the Syriac Alexander Legend (c. 630), in which the pagan conqueror Alexander is recast as a near-prophetic monotheist. Cain’s burial learned from a raven (5:31) matches a motif in the Jewish Pirqe de-Rabbi Eliezer and Targumic tradition. The pattern, documented in Gabriel Said Reynolds’s The Qur’an and the Bible (2018), is that the Quran’s extra-biblical material clusters precisely around the apocrypha and homiletic legends of its time and region.</w:t>
+      </w:r>
+    </w:p>
+    <w:p>
+      <w:pPr>
+        <w:spacing w:after="160" w:before="120"/>
+        <w:jc w:val="both"/>
+      </w:pPr>
+      <w:r>
+        <w:rPr>
+          <w:b/>
+          <w:bCs/>
+        </w:rPr>
+        <w:t xml:space="preserve">Common Muslim Responses. </w:t>
+      </w:r>
+      <w:r>
+        <w:t xml:space="preserve">Muslim scholars respond that shared content does not entail borrowing: if these stories happened, the true God who inspired earlier prophets would naturally recount them, and their survival in apocryphal works merely shows that fragments of authentic revelation persisted there. The Quran, on this view, corrects and purifies the garbled versions — affirming what was true and discarding the legendary excess — which is exactly what a final revelation confirming prior scripture (Part I) should do. The clay-birds and cradle miracles glorify Jesus as a true prophet; their presence in earlier texts is testimony to a common prophetic source, not literary dependence.</w:t>
+      </w:r>
+    </w:p>
+    <w:p>
+      <w:pPr>
+        <w:spacing w:after="160" w:before="120"/>
+        <w:jc w:val="both"/>
+      </w:pPr>
+      <w:r>
+        <w:rPr>
+          <w:b/>
+          <w:bCs/>
+        </w:rPr>
+        <w:t xml:space="preserve">Counter-Rebuttal. </w:t>
+      </w:r>
+      <w:r>
+        <w:t xml:space="preserve">Critics reply that the “common source” defense collides with the Quran’s own claim in 11:49 that this material was unknown to Muhammad and his people — it was not unknown; it was in regional circulation. More tellingly, the Quran reproduces features that are signatures of the apocryphal texts specifically, including their legendary embellishments: the clay-birds miracle exists nowhere in any first-century source and originates in a late, fanciful gospel the church rejected as inauthentic, so to affirm it as historical fact is to canonize a known fiction. The Alexander parallel is decisive: the Syriac Legend predates the surah by only years, recasts a historical pagan polytheist as Allah’s servant, and supplies the Gog-Magog barrier detail the Quran echoes — a case of a recent human legend, not ancient revelation, entering the text. An omniscient author distinguishing truth from later accretion would not have absorbed the accretions.</w:t>
+      </w:r>
+    </w:p>
+    <w:p>
+      <w:pPr>
+        <w:pStyle w:val="Heading2"/>
+      </w:pPr>
+      <w:r>
+        <w:t xml:space="preserve">4. The Inheritance Arithmetic (the ‘Awl Problem)</w:t>
+      </w:r>
+    </w:p>
+    <w:p>
+      <w:pPr>
+        <w:spacing w:after="160" w:before="120"/>
+        <w:jc w:val="both"/>
+      </w:pPr>
+      <w:r>
+        <w:rPr>
+          <w:b/>
+          <w:bCs/>
+        </w:rPr>
+        <w:t xml:space="preserve">The Critique. </w:t>
+      </w:r>
+      <w:r>
+        <w:t xml:space="preserve">The Quran legislates fixed inheritance fractions in Surah 4:11–12 and 4:176, presenting them as a precise divine apportionment: “an obligation imposed by Allah; indeed, Allah is Knowing and Wise” (4:11). But in determinate cases the mandated shares sum to more than the whole estate. The standard example: a woman dies leaving a husband (Quran-assigned 1/4 when there are children — or 1/2 with none), two or more daughters (collectively 2/3), and both parents (1/6 each). With a husband (1/4), two daughters (2/3), and a mother (1/6), the fractions total 1/4 + 2/3 + 1/6 = 13/12 — more than the entire inheritance. Other configurations (the so-called minbariyya case) likewise overflow. A set of divinely fixed shares that cannot be simultaneously satisfied is, the critic argues, a mathematical defect in a text that claims its rules come from the All-Knowing.</w:t>
+      </w:r>
+    </w:p>
+    <w:p>
+      <w:pPr>
+        <w:spacing w:after="160" w:before="120"/>
+        <w:jc w:val="both"/>
+      </w:pPr>
+      <w:r>
+        <w:rPr>
+          <w:b/>
+          <w:bCs/>
+        </w:rPr>
+        <w:t xml:space="preserve">Common Muslim Responses. </w:t>
+      </w:r>
+      <w:r>
+        <w:t xml:space="preserve">Muslim jurists answer with the doctrine of ‘awl, attributed to the caliph Umar in consultation with the Companions: when the fractions exceed unity, the estate is divided proportionally — the denominator is raised to the sum of the shares (e.g., 12 becomes 13), and each heir receives their fraction of that larger base, so all are reduced pro rata and the estate distributes exactly. This, they say, is not a flaw but a procedure for the rare overflow cases, analogous to proportional reduction in any system of competing fixed claims; the Quran sets the shares and the science of fara’id supplies the lawful method of resolution. Some add that the verses are not all “fractions of the whole” — certain shares apply to the residue — so apparent overflows dissolve on correct application.</w:t>
+      </w:r>
+    </w:p>
+    <w:p>
+      <w:pPr>
+        <w:spacing w:after="160" w:before="120"/>
+        <w:jc w:val="both"/>
+      </w:pPr>
+      <w:r>
+        <w:rPr>
+          <w:b/>
+          <w:bCs/>
+        </w:rPr>
+        <w:t xml:space="preserve">Counter-Rebuttal. </w:t>
+      </w:r>
+      <w:r>
+        <w:t xml:space="preserve">Critics note that ‘awl is itself the admission: the fractions as revealed do overflow, which is why a human corrective had to be devised — and devised not by the text but by Umar, after Muhammad’s death, exactly as with the missing verses and the codex standardization (Part III). A perfectly knowing legislator stating shares as binding obligations would not have set figures that contradict one another in foreseeable, common family structures, leaving the faithful to invent a workaround the revelation never mentions. The “fraction of the residue” reply does not save the classic husband-daughters-parents case, where every share in dispute is by consensus a fraction of the whole. That the resolution works arithmetically is not in question; that it was needed at all is the point — divine arithmetic should balance without amendment.</w:t>
+      </w:r>
+    </w:p>
+    <w:p>
+      <w:pPr>
+        <w:pStyle w:val="Heading2"/>
+      </w:pPr>
+      <w:r>
+        <w:t xml:space="preserve">5. Pagan Continuity in Islamic Ritual</w:t>
+      </w:r>
+    </w:p>
+    <w:p>
+      <w:pPr>
+        <w:spacing w:after="160" w:before="120"/>
+        <w:jc w:val="both"/>
+      </w:pPr>
+      <w:r>
+        <w:rPr>
+          <w:b/>
+          <w:bCs/>
+        </w:rPr>
+        <w:t xml:space="preserve">The Critique. </w:t>
+      </w:r>
+      <w:r>
+        <w:t xml:space="preserve">Islam presents itself as the restoration of pure Abrahamic monotheism, sweeping away pagan accretion. Yet its central rites visibly continue pre-Islamic Arabian practice. The Kaaba was the pagan sanctuary of Mecca, housing some 360 idols including Hubal before Muhammad cleansed it; the pilgrimage (hajj), the circumambulation (tawaf), the running between Safa and Marwa, the standing at Arafat, and the stoning at Mina were performed by the pagan Arabs before Islam and were retained, reoriented to Allah. The Black Stone set in the Kaaba’s corner is, by scholarly consensus, a pre-Islamic baetyl — a venerated sacred stone of the kind common in Semitic paganism — and pilgrims kiss it still. Umar ibn al-Khattab’s own remark is preserved in Sahih al-Bukhari 1597: “I know that you are a stone and can neither benefit nor harm; had I not seen the Prophet kissing you, I would not kiss you.” Even Quran 2:158 concedes the pagan association of Safa and Marwa while licensing the rite. The critic concludes that a religion claiming to abolish idolatry institutionalized the ritual furniture of the idolaters.</w:t>
+      </w:r>
+    </w:p>
+    <w:p>
+      <w:pPr>
+        <w:spacing w:after="160" w:before="120"/>
+        <w:jc w:val="both"/>
+      </w:pPr>
+      <w:r>
+        <w:rPr>
+          <w:b/>
+          <w:bCs/>
+        </w:rPr>
+        <w:t xml:space="preserve">Common Muslim Responses. </w:t>
+      </w:r>
+      <w:r>
+        <w:t xml:space="preserve">Muslim scholars answer that these rites are Abrahamic in origin, not pagan: Abraham and Ishmael built the Kaaba and instituted the pilgrimage (Quran 2:125–127; 22:26–27), and the pagans had merely corrupted an originally monotheistic sanctuary, which Islam restored to its true purpose. The retained forms were thus reclaimed, not borrowed — emptied of idolatry and refilled with tawhid. The Black Stone carries no divinity; Umar’s statement is precisely the proof that Muslims venerate it only in obedient imitation of the Prophet, not as an object of worship, which guards the rite from idolatry. Quran 2:158 reassures Muslims that performing Safa–Marwa is acceptable despite its abuse by pagans.</w:t>
+      </w:r>
+    </w:p>
+    <w:p>
+      <w:pPr>
+        <w:spacing w:after="160" w:before="120"/>
+        <w:jc w:val="both"/>
+      </w:pPr>
+      <w:r>
+        <w:rPr>
+          <w:b/>
+          <w:bCs/>
+        </w:rPr>
+        <w:t xml:space="preserve">Counter-Rebuttal. </w:t>
+      </w:r>
+      <w:r>
+        <w:t xml:space="preserve">Critics respond that the Abrahamic-origin claim is asserted by the Quran but unattested historically: there is no evidence outside the Islamic tradition that Abraham was ever in Mecca or built the Kaaba, while there is abundant evidence that the sanctuary, the stone, and the pilgrimage rites were live pagan Arabian practice on the eve of Islam. The simplest historical explanation of why Islam’s rituals match the pre-Islamic ones is continuity, not coincidental restoration. Umar’s candid words cut the other way: a man kissing a stone he knows to be inert, solely because the Prophet did, is performing exactly the imitative stone-veneration the reform was supposed to end — and 2:158’s need to reassure converts that a formerly pagan rite is permissible concedes the very continuity at issue. Renaming a practice does not change its provenance.</w:t>
+      </w:r>
+    </w:p>
+    <w:p>
+      <w:pPr>
+        <w:pStyle w:val="Heading2"/>
+      </w:pPr>
+      <w:r>
+        <w:t xml:space="preserve">6. The Night Journey and the Negotiated Prayers</w:t>
+      </w:r>
+    </w:p>
+    <w:p>
+      <w:pPr>
+        <w:spacing w:after="160" w:before="120"/>
+        <w:jc w:val="both"/>
+      </w:pPr>
+      <w:r>
+        <w:rPr>
+          <w:b/>
+          <w:bCs/>
+        </w:rPr>
+        <w:t xml:space="preserve">The Critique. </w:t>
+      </w:r>
+      <w:r>
+        <w:t xml:space="preserve">The number of the five daily prayers — the second pillar of Islam — derives not from the Quran but from the ascension narrative (mi‘raj) in the sahih hadith (Sahih al-Bukhari 349; 3887). In it, Allah first decrees fifty prayers a day. Descending, Muhammad meets Moses, who says the community cannot bear fifty and tells him to return and ask for a reduction. Muhammad goes back; Allah lowers the number. This repeats — Moses sending him back again and again — until the obligation is reduced from fifty to five, at which point Moses still urges another return, but Muhammad is ashamed to ask more. Allah then says: “They are five and they are fifty; the word with Me does not change” (Bukhari 7517). The theological problem is internal: an omniscient God set a figure He then revised nine times at human prompting, with Moses — not God — foreseeing the practical impossibility the Almighty had apparently overlooked, and the closing formula “My word does not change” appears precisely after the word has changed.</w:t>
+      </w:r>
+    </w:p>
+    <w:p>
+      <w:pPr>
+        <w:spacing w:after="160" w:before="120"/>
+        <w:jc w:val="both"/>
+      </w:pPr>
+      <w:r>
+        <w:rPr>
+          <w:b/>
+          <w:bCs/>
+        </w:rPr>
+        <w:t xml:space="preserve">Common Muslim Responses. </w:t>
+      </w:r>
+      <w:r>
+        <w:t xml:space="preserve">Muslim scholars answer that the episode is divine pedagogy, not divine error: Allah knew the outcome from eternity and staged the exchange to teach the Prophet and the umma the breadth of His mercy and the high honor of prayer (fifty in reward for five), and to display Moses’s compassionate experience with his own stiff-necked nation. God’s “changing” the number is His sovereign prerogative within a process He fully foreknew; the final formula means the reward-value (fifty) is fixed even as the obligation (five) is eased. The narrative magnifies mercy, not ignorance.</w:t>
+      </w:r>
+    </w:p>
+    <w:p>
+      <w:pPr>
+        <w:spacing w:after="160" w:before="120"/>
+        <w:jc w:val="both"/>
+      </w:pPr>
+      <w:r>
+        <w:rPr>
+          <w:b/>
+          <w:bCs/>
+        </w:rPr>
+        <w:t xml:space="preserve">Counter-Rebuttal. </w:t>
+      </w:r>
+      <w:r>
+        <w:t xml:space="preserve">Critics reply that the pedagogy reading explains why a storyteller would tell it, not why an omniscient God would enact it: a being who knows the end from the beginning does not need to issue fifty, be talked down in stages, and rely on Moses to flag the impossibility — the scene is intelligible as folklore about a bargaining deity and unintelligible as the act of the omniscient. That Moses, on his tenth-century-BC experience, repeatedly knows better than the freshly issued divine decree inverts the order of knowledge the doctrine requires. And anchoring a pillar of the religion — the prayer count every Muslim performs daily — in a hadith vision rather than the Quran returns the critique to Part VIII: the most basic practice rests on the same contested transmission whose reliability the tradition cannot consistently defend.</w:t>
+      </w:r>
+    </w:p>
+    <w:p>
+      <w:pPr>
+        <w:pStyle w:val="Heading1"/>
+        <w:pageBreakBefore/>
+      </w:pPr>
+      <w:r>
         <w:t xml:space="preserve">Conclusion: The Cumulative Case</w:t>
       </w:r>
     </w:p>
@@ -3171,7 +3525,7 @@
         <w:jc w:val="both"/>
       </w:pPr>
       <w:r>
-        <w:t xml:space="preserve">The arguments compiled here share a single method: they take Islam’s claims about itself — a perfectly preserved book, free of contradiction, from an all-knowing God, delivered through a morally exemplary prophet, explained by an authenticated Sunna and guarded by an unerring consensus — and test each claim against Islam’s own canonical sources. On the critics’ assessment, every pillar of that self-description is contradicted from within: the Quran affirms scriptures it also contradicts (Part I); it contains tensions its own falsification test forbids (Part II); its perfect preservation is denied by Bukhari, Muslim, the companion codices, and the Sanaa palimpsest (Part III); its picture of history and nature is the picture of seventh-century late antiquity (Part IV); its prophet’s career, as remembered by Islam’s most authentic books, repeatedly fails the tests the Quran itself announces (Part V); its theology asserts attributes it cannot reconcile (Part VI); its law canonizes seventh-century institutions — child marriage, the dhimma, slave concubinage, sanctioned deception — as timeless divine morality (Part VII); and its epistemology cannot keep its rituals without keeping its scandals (Part VIII).</w:t>
+        <w:t xml:space="preserve">The arguments compiled here share a single method: they take Islam’s claims about itself — a perfectly preserved book, free of contradiction, from an all-knowing God, delivered through a morally exemplary prophet, explained by an authenticated Sunna and guarded by an unerring consensus — and test each claim against Islam’s own canonical sources. On the critics’ assessment, every pillar of that self-description is contradicted from within: the Quran affirms scriptures it also contradicts (Part I); it contains tensions its own falsification test forbids (Part II); its perfect preservation is denied by Bukhari, Muslim, the companion codices, and the Sanaa palimpsest (Part III); its picture of history and nature is the picture of seventh-century late antiquity (Part IV); its prophet’s career, as remembered by Islam’s most authentic books, repeatedly fails the tests the Quran itself announces (Part V); its theology asserts attributes it cannot reconcile (Part VI); its law canonizes seventh-century institutions — child marriage, the dhimma, slave concubinage, sanctioned deception — as timeless divine morality (Part VII); its epistemology cannot keep its rituals without keeping its scandals (Part VIII); and its own advertised proofs reverse on inspection — prophecies that miscarried, an unfalsifiable literary miracle, demonstrably borrowed narratives, inheritance shares that overflow, and rites of pre-Islamic paganism (Part IX).</w:t>
       </w:r>
     </w:p>
     <w:p>
@@ -3241,6 +3595,62 @@
       </w:pPr>
       <w:r>
         <w:t xml:space="preserve">Ibn Ishaq, Sirat Rasul Allah (trans. A. Guillaume, The Life of Muhammad, Oxford, 1955).</w:t>
+      </w:r>
+    </w:p>
+    <w:p>
+      <w:pPr>
+        <w:pStyle w:val="ListParagraph"/>
+        <w:numPr>
+          <w:ilvl w:val="0"/>
+          <w:numId w:val="2"/>
+        </w:numPr>
+        <w:spacing w:after="80"/>
+        <w:jc w:val="both"/>
+      </w:pPr>
+      <w:r>
+        <w:t xml:space="preserve">Gabriel Said Reynolds, The Qur'an and the Bible: Text and Commentary (Yale, 2018); on apocryphal and Syriac parallels (Infancy Gospel of Thomas, the Syriac Alexander Legend, the Seven Sleepers).</w:t>
+      </w:r>
+    </w:p>
+    <w:p>
+      <w:pPr>
+        <w:pStyle w:val="ListParagraph"/>
+        <w:numPr>
+          <w:ilvl w:val="0"/>
+          <w:numId w:val="2"/>
+        </w:numPr>
+        <w:spacing w:after="80"/>
+        <w:jc w:val="both"/>
+      </w:pPr>
+      <w:r>
+        <w:t xml:space="preserve">Abd al-Qahir al-Jurjani, Dala'il al-I'jaz (on Quranic inimitability); Navid Kermani and modern studies of the i'jaz doctrine and the tahaddi challenge.</w:t>
+      </w:r>
+    </w:p>
+    <w:p>
+      <w:pPr>
+        <w:pStyle w:val="ListParagraph"/>
+        <w:numPr>
+          <w:ilvl w:val="0"/>
+          <w:numId w:val="2"/>
+        </w:numPr>
+        <w:spacing w:after="80"/>
+        <w:jc w:val="both"/>
+      </w:pPr>
+      <w:r>
+        <w:t xml:space="preserve">On inheritance and 'awl: the fara'id literature; IslamQA 131556; classical attribution of 'awl to Umar ibn al-Khattab.</w:t>
+      </w:r>
+    </w:p>
+    <w:p>
+      <w:pPr>
+        <w:pStyle w:val="ListParagraph"/>
+        <w:numPr>
+          <w:ilvl w:val="0"/>
+          <w:numId w:val="2"/>
+        </w:numPr>
+        <w:spacing w:after="80"/>
+        <w:jc w:val="both"/>
+      </w:pPr>
+      <w:r>
+        <w:t xml:space="preserve">On ritual origins: F.E. Peters, The Hajj (Princeton, 1994); G.R. Hawting, The Idea of Idolatry and the Emergence of Islam (Cambridge, 1999); Black Stone and Kaaba entries in the Encyclopaedia of Islam.</w:t>
       </w:r>
     </w:p>
     <w:p>

</xml_diff>